<commit_message>
Word generation new (WIP)
</commit_message>
<xml_diff>
--- a/src/Word_Doc_Builder/Word_Doc_Process_Template (DE).docx
+++ b/src/Word_Doc_Builder/Word_Doc_Process_Template (DE).docx
@@ -1446,6 +1446,30 @@
         </w:rPr>
         <w:t>{% endif %}</w:t>
       </w:r>
+      <w:r>
+        <w:rPr>
+          <w:sz w:val="20"/>
+          <w:szCs w:val="20"/>
+          <w:lang w:val="de-DE"/>
+        </w:rPr>
+        <w:t>{% if leaf.</w:t>
+      </w:r>
+      <w:r>
+        <w:rPr>
+          <w:sz w:val="20"/>
+          <w:szCs w:val="20"/>
+          <w:lang w:val="de-DE"/>
+        </w:rPr>
+        <w:t>qa.elements</w:t>
+      </w:r>
+      <w:r>
+        <w:rPr>
+          <w:sz w:val="20"/>
+          <w:szCs w:val="20"/>
+          <w:lang w:val="de-DE"/>
+        </w:rPr>
+        <w:t xml:space="preserve"> %}</w:t>
+      </w:r>
     </w:p>
     <w:p>
       <w:pPr>
@@ -1538,7 +1562,31 @@
           <w:szCs w:val="20"/>
           <w:lang w:val="de-DE"/>
         </w:rPr>
-        <w:t>{%endfor%}</w:t>
+        <w:t>{% endif %}</w:t>
+      </w:r>
+      <w:r>
+        <w:rPr>
+          <w:sz w:val="20"/>
+          <w:szCs w:val="20"/>
+          <w:lang w:val="de-DE"/>
+        </w:rPr>
+        <w:t xml:space="preserve"> </w:t>
+      </w:r>
+      <w:r>
+        <w:rPr>
+          <w:sz w:val="20"/>
+          <w:szCs w:val="20"/>
+          <w:lang w:val="de-DE"/>
+        </w:rPr>
+        <w:t>{%endfor%</w:t>
+      </w:r>
+      <w:r>
+        <w:rPr>
+          <w:sz w:val="20"/>
+          <w:szCs w:val="20"/>
+          <w:lang w:val="de-DE"/>
+        </w:rPr>
+        <w:t>}</w:t>
       </w:r>
     </w:p>
     <w:p>

</xml_diff>